<commit_message>
Simulatory jen na pocitaci; Linux: sbalene panely i ve Firefoxu 111
- JenNaPocitaci (obrazovka >= 1024 px a mys): /windows, /macos i kurz SQL
  se na telefonu a tabletu nespusti, misto nich vysvetleni (Karel 29. 9.)
- SQL: webova podoba jen pro pocitac v uzkem okne; texty, navody a plan
  hodin uz neslibuji kurz na telefonu
- .sbalitelny[inert] { visibility: hidden }: Firefox 111 inert neumi
- CLAUDE.md: predavka

Co-Authored-By: Claude Opus 5.5 <noreply@anthropic.com>
</commit_message>
<xml_diff>
--- a/public/materialy/1L/8/2. Vlastní databáze z Excelu/Návod - vlastní databáze z Excelu.docx
+++ b/public/materialy/1L/8/2. Vlastní databáze z Excelu/Návod - vlastní databáze z Excelu.docx
@@ -14,7 +14,7 @@
           <w:sz w:val="44"/>
           <w:szCs w:val="44"/>
         </w:rPr>
-        <w:t xml:space="preserve">Vlastní databáze z Excelu</w:t>
+        <w:t xml:space="preserve">Vlastní databáze z Excelu</w:t>
       </w:r>
     </w:p>
     <w:p>
@@ -35,7 +35,7 @@
         <w:spacing w:after="100"/>
       </w:pPr>
       <w:r>
-        <w:t xml:space="preserve">Kurz SQL pracuje s hotovou databází knihovny. Stejně dobře se ale můžeš ptát svých vlastních dat: tabulku si připravíš v Excelu, nahraješ ji do DB Browseru a ptáš se jí v SQL. Výsledek pak vrátíš zpátky do Excelu a třeba z něj uděláš graf.</w:t>
+        <w:t xml:space="preserve">Kurz SQL pracuje s hotovou databází knihovny. Stejně dobře se ale můžeš ptát svých vlastních dat: tabulku si připravíš v Excelu, nahraješ ji do DB Browseru a ptáš se jí v SQL. Výsledek pak vrátíš zpátky do Excelu a třeba z něj uděláš graf.</w:t>
       </w:r>
     </w:p>
     <w:tbl>
@@ -250,7 +250,7 @@
                 <w:sz w:val="21"/>
                 <w:szCs w:val="21"/>
               </w:rPr>
-              <w:t xml:space="preserve">3. Založ databázi a nahraj CSV</w:t>
+              <w:t xml:space="preserve">3. Založ databázi a nahraj CSV</w:t>
             </w:r>
           </w:p>
         </w:tc>
@@ -306,7 +306,7 @@
                 <w:sz w:val="21"/>
                 <w:szCs w:val="21"/>
               </w:rPr>
-              <w:t xml:space="preserve">4. Ptej se v SQL</w:t>
+              <w:t xml:space="preserve">4. Ptej se v SQL</w:t>
             </w:r>
           </w:p>
         </w:tc>
@@ -464,7 +464,7 @@
           <w:sz w:val="20"/>
           <w:szCs w:val="20"/>
         </w:rPr>
-        <w:t xml:space="preserve">Nechceš začínat v Excelu? V bance u tohoto návodu je hotový soubor filmy.csv – začni rovnou krokem 3.</w:t>
+        <w:t xml:space="preserve">Nechceš začínat v Excelu? V bance u tohoto návodu je hotový soubor filmy.csv – začni rovnou krokem 3.</w:t>
       </w:r>
     </w:p>
     <w:p>
@@ -472,7 +472,7 @@
         <w:pStyle w:val="Heading1"/>
       </w:pPr>
       <w:r>
-        <w:t xml:space="preserve">1. Připrav tabulku v Excelu</w:t>
+        <w:t xml:space="preserve">1. Připrav tabulku v Excelu</w:t>
       </w:r>
     </w:p>
     <w:p>
@@ -480,7 +480,7 @@
         <w:spacing w:after="100"/>
       </w:pPr>
       <w:r>
-        <w:t xml:space="preserve">Téma je na tobě: filmy, hry, sport, mobily, výsledky měření z dílny… Stačí 8 až 20 řádků a 3 až 5 sloupců, z nichž aspoň jeden je číslo. Takhle vypadá ukázka:</w:t>
+        <w:t xml:space="preserve">Téma je na tobě: filmy, hry, sport, mobily, výsledky měření z dílny… Stačí 8 až 20 řádků a 3 až 5 sloupců, z nichž aspoň jeden je číslo. Takhle vypadá ukázka:</w:t>
       </w:r>
     </w:p>
     <w:tbl>
@@ -955,7 +955,7 @@
                 <w:sz w:val="21"/>
                 <w:szCs w:val="21"/>
               </w:rPr>
-              <w:t xml:space="preserve">Harry Potter a Kámen mudrců</w:t>
+              <w:t xml:space="preserve">Harry Potter a Kámen mudrců</w:t>
             </w:r>
           </w:p>
         </w:tc>
@@ -1470,7 +1470,7 @@
         <w:spacing w:after="100"/>
       </w:pPr>
       <w:r>
-        <w:t xml:space="preserve">Aby se tabulka dala nahrát a dobře se s ní počítalo, drž se těchto pravidel:</w:t>
+        <w:t xml:space="preserve">Aby se tabulka dala nahrát a dobře se s ní počítalo, drž se těchto pravidel:</w:t>
       </w:r>
     </w:p>
     <w:p>
@@ -1483,7 +1483,7 @@
         <w:spacing w:after="60"/>
       </w:pPr>
       <w:r>
-        <w:t xml:space="preserve">Tabulka začíná v buňce A1. V prvním řádku jsou názvy sloupců, pod nimi data.</w:t>
+        <w:t xml:space="preserve">Tabulka začíná v buňce A1. V prvním řádku jsou názvy sloupců, pod nimi data.</w:t>
       </w:r>
     </w:p>
     <w:p>
@@ -1496,7 +1496,7 @@
         <w:spacing w:after="60"/>
       </w:pPr>
       <w:r>
-        <w:t xml:space="preserve">Názvy sloupců piš krátce. Háčky, čárky a mezery program sám odstraní: z „Moje hodnocení“ bude </w:t>
+        <w:t xml:space="preserve">Názvy sloupců piš krátce. Háčky, čárky a mezery program sám odstraní: z „Moje hodnocení“ bude </w:t>
       </w:r>
       <w:r>
         <w:rPr>
@@ -1508,7 +1508,7 @@
         <w:t xml:space="preserve">moje_hodnoceni</w:t>
       </w:r>
       <w:r>
-        <w:t xml:space="preserve">. Právě takový název pak píšeš v SQL.</w:t>
+        <w:t xml:space="preserve">. Právě takový název pak píšeš v SQL.</w:t>
       </w:r>
     </w:p>
     <w:p>
@@ -1521,7 +1521,7 @@
         <w:spacing w:after="60"/>
       </w:pPr>
       <w:r>
-        <w:t xml:space="preserve">V jednom sloupci je vždycky jen jeden druh údaje: buď čísla, nebo text.</w:t>
+        <w:t xml:space="preserve">V jednom sloupci je vždycky jen jeden druh údaje: buď čísla, nebo text.</w:t>
       </w:r>
     </w:p>
     <w:p>
@@ -1546,7 +1546,7 @@
         <w:t xml:space="preserve">250</w:t>
       </w:r>
       <w:r>
-        <w:t xml:space="preserve">, ne „250 Kč“, a bez mezer mezi tisíci. Desetinná čárka nevadí (</w:t>
+        <w:t xml:space="preserve">, ne „250 Kč“, a bez mezer mezi tisíci. Desetinná čárka nevadí (</w:t>
       </w:r>
       <w:r>
         <w:rPr>
@@ -1558,7 +1558,7 @@
         <w:t xml:space="preserve">9,5</w:t>
       </w:r>
       <w:r>
-        <w:t xml:space="preserve">). Když ve sloupci s čísly bude i jen jedna jednotka nebo slovo, uloží se celý sloupec jako text a nepůjde s ním počítat.</w:t>
+        <w:t xml:space="preserve">). Když ve sloupci s čísly bude i jen jedna jednotka nebo slovo, uloží se celý sloupec jako text a nepůjde s ním počítat.</w:t>
       </w:r>
     </w:p>
     <w:p>
@@ -1584,7 +1584,7 @@
         <w:spacing w:after="60"/>
       </w:pPr>
       <w:r>
-        <w:t xml:space="preserve">Datum se uloží jako text (12.03.2026) a podle něj se špatně řadí. Když ho potřebuješ, přidej si sloupec rok (případně mesic) jako obyčejné číslo.</w:t>
+        <w:t xml:space="preserve">Datum se uloží jako text (12.03.2026) a podle něj se špatně řadí. Když ho potřebuješ, přidej si sloupec rok (případně mesic) jako obyčejné číslo.</w:t>
       </w:r>
     </w:p>
     <w:p>
@@ -1615,7 +1615,7 @@
         <w:t xml:space="preserve">1.	</w:t>
       </w:r>
       <w:r>
-        <w:t xml:space="preserve">Ulož si nejdřív sešit normálně (.xlsx), ať máš tabulku i s formátováním.</w:t>
+        <w:t xml:space="preserve">Ulož si nejdřív sešit normálně (.xlsx), ať máš tabulku i s formátováním.</w:t>
       </w:r>
     </w:p>
     <w:p>
@@ -1630,7 +1630,7 @@
         <w:t xml:space="preserve">2.	</w:t>
       </w:r>
       <w:r>
-        <w:t xml:space="preserve">Soubor → Uložit jako (v novějším Excelu může být Uložit kopii). Jako typ souboru vyber takový, který začíná CSV – třeba CSV UTF-8. Program zvládne oba druhy CSV, které Excel nabízí.</w:t>
+        <w:t xml:space="preserve">Soubor → Uložit jako (v novějším Excelu může být Uložit kopii). Jako typ souboru vyber takový, který začíná CSV – třeba CSV UTF-8. Program zvládne oba druhy CSV, které Excel nabízí.</w:t>
       </w:r>
     </w:p>
     <w:p>
@@ -1658,7 +1658,7 @@
           <w:sz w:val="20"/>
           <w:szCs w:val="20"/>
         </w:rPr>
-        <w:t xml:space="preserve">Google Tabulky: Soubor → Stáhnout → formát .csv. Na Macu v Excelu stejně: Soubor → Uložit jako a formát CSV.</w:t>
+        <w:t xml:space="preserve">Google Tabulky: Soubor → Stáhnout → formát .csv. Na Macu v Excelu stejně: Soubor → Uložit jako a formát CSV.</w:t>
       </w:r>
     </w:p>
     <w:p>
@@ -1666,7 +1666,7 @@
         <w:pStyle w:val="Heading1"/>
       </w:pPr>
       <w:r>
-        <w:t xml:space="preserve">3. Založ databázi a nahraj do ní CSV</w:t>
+        <w:t xml:space="preserve">3. Založ databázi a nahraj do ní CSV</w:t>
       </w:r>
     </w:p>
     <w:p>
@@ -1674,7 +1674,7 @@
         <w:spacing w:after="100"/>
       </w:pPr>
       <w:r>
-        <w:t xml:space="preserve">Otevři karelhlas.vercel.app/sql na počítači (na telefonu se program neotevře, jen webová podoba kurzu).</w:t>
+        <w:t xml:space="preserve">Otevři karelhlas.vercel.app/sql na počítači s myší – na telefonu ani na tabletu kurz neběží.</w:t>
       </w:r>
     </w:p>
     <w:p>
@@ -1701,7 +1701,7 @@
         <w:t xml:space="preserve">filmy</w:t>
       </w:r>
       <w:r>
-        <w:t xml:space="preserve">, a klikni na Vytvořit.</w:t>
+        <w:t xml:space="preserve">, a klikni na Vytvořit.</w:t>
       </w:r>
     </w:p>
     <w:p>
@@ -1716,7 +1716,7 @@
         <w:t xml:space="preserve">2.	</w:t>
       </w:r>
       <w:r>
-        <w:t xml:space="preserve">Otevře se okno Upravit definici tabulky. Zavři ho tlačítkem Zrušit – tabulku nebudeš skládat ručně, přijde z CSV.</w:t>
+        <w:t xml:space="preserve">Otevře se okno Upravit definici tabulky. Zavři ho tlačítkem Zrušit – tabulku nebudeš skládat ručně, přijde z CSV.</w:t>
       </w:r>
     </w:p>
     <w:p>
@@ -1731,7 +1731,7 @@
         <w:t xml:space="preserve">3.	</w:t>
       </w:r>
       <w:r>
-        <w:t xml:space="preserve">Soubor → Importovat tabulku z CSV… a vyber svůj soubor. Soubor můžeš do okna programu i přetáhnout myší.</w:t>
+        <w:t xml:space="preserve">Soubor → Importovat tabulku z CSV… a vyber svůj soubor. Soubor můžeš do okna programu i přetáhnout myší.</w:t>
       </w:r>
     </w:p>
     <w:p>
@@ -1746,7 +1746,7 @@
         <w:t xml:space="preserve">4.	</w:t>
       </w:r>
       <w:r>
-        <w:t xml:space="preserve">V okně Importovat tabulku z CSV zkontroluj název tabulky (je podle názvu souboru, můžeš ho přepsat) a že je zaškrtnuté První řádek jsou názvy sloupců. Oddělovač program pozná sám.</w:t>
+        <w:t xml:space="preserve">V okně Importovat tabulku z CSV zkontroluj název tabulky (je podle názvu souboru, můžeš ho přepsat) a že je zaškrtnuté První řádek jsou názvy sloupců. Oddělovač program pozná sám.</w:t>
       </w:r>
     </w:p>
     <w:p>
@@ -1761,7 +1761,7 @@
         <w:t xml:space="preserve">5.	</w:t>
       </w:r>
       <w:r>
-        <w:t xml:space="preserve">Podívej se do náhledu na typ u každého sloupce: INTEGER = celé číslo, REAL = desetinné číslo, TEXT = text. Když je u sloupce s čísly TEXT, je v něm v Excelu něco navíc (jednotka, mezera, slovo) – oprav to a ulož CSV znovu.</w:t>
+        <w:t xml:space="preserve">Podívej se do náhledu na typ u každého sloupce: INTEGER = celé číslo, REAL = desetinné číslo, TEXT = text. Když je u sloupce s čísly TEXT, je v něm v Excelu něco navíc (jednotka, mezera, slovo) – oprav to a ulož CSV znovu.</w:t>
       </w:r>
     </w:p>
     <w:p>
@@ -1791,7 +1791,7 @@
         <w:t xml:space="preserve">7.	</w:t>
       </w:r>
       <w:r>
-        <w:t xml:space="preserve">Zapsat změny (Ctrl+S). Dokud změny nezapíšeš, je tabulka jen v paměti programu a po zavření by se ztratila.</w:t>
+        <w:t xml:space="preserve">Zapsat změny (Ctrl+S). Dokud změny nezapíšeš, je tabulka jen v paměti programu a po zavření by se ztratila.</w:t>
       </w:r>
     </w:p>
     <w:p>
@@ -1799,7 +1799,7 @@
         <w:spacing w:after="100"/>
       </w:pPr>
       <w:r>
-        <w:t xml:space="preserve">Na kartě Prohlížet data uvidíš tabulku jako v Excelu. Na kartě Struktura databáze najdeš přesné názvy sloupců – ty budeš psát v SQL.</w:t>
+        <w:t xml:space="preserve">Na kartě Prohlížet data uvidíš tabulku jako v Excelu. Na kartě Struktura databáze najdeš přesné názvy sloupců – ty budeš psát v SQL.</w:t>
       </w:r>
     </w:p>
     <w:p>
@@ -1807,7 +1807,7 @@
         <w:pStyle w:val="Heading1"/>
       </w:pPr>
       <w:r>
-        <w:t xml:space="preserve">4. Ptej se v SQL</w:t>
+        <w:t xml:space="preserve">4. Ptej se v SQL</w:t>
       </w:r>
     </w:p>
     <w:p>
@@ -1815,7 +1815,7 @@
         <w:spacing w:after="100"/>
       </w:pPr>
       <w:r>
-        <w:t xml:space="preserve">Karta Spustit SQL, napiš dotaz a stiskni F5. Takhle se dá ptát ukázkové tabulky filmy:</w:t>
+        <w:t xml:space="preserve">Karta Spustit SQL, napiš dotaz a stiskni F5. Takhle se dá ptát ukázkové tabulky filmy:</w:t>
       </w:r>
     </w:p>
     <w:tbl>
@@ -1976,7 +1976,7 @@
                 <w:sz w:val="21"/>
                 <w:szCs w:val="21"/>
               </w:rPr>
-              <w:t xml:space="preserve">Které filmy jsou z minulého století?</w:t>
+              <w:t xml:space="preserve">Které filmy jsou z minulého století?</w:t>
             </w:r>
           </w:p>
         </w:tc>
@@ -2257,7 +2257,7 @@
         <w:spacing w:after="60"/>
       </w:pPr>
       <w:r>
-        <w:t xml:space="preserve">Program píše desetinná čísla s tečkou (9.5), jak je v SQL zvykem. Do Excelu se vrátí s čárkou.</w:t>
+        <w:t xml:space="preserve">Program píše desetinná čísla s tečkou (9.5), jak je v SQL zvykem. Do Excelu se vrátí s čárkou.</w:t>
       </w:r>
     </w:p>
     <w:p>
@@ -2273,7 +2273,7 @@
         <w:spacing w:after="100"/>
       </w:pPr>
       <w:r>
-        <w:t xml:space="preserve">Vymysli na svou tabulku aspoň pět otázek a ke každé napiš dotaz:</w:t>
+        <w:t xml:space="preserve">Vymysli na svou tabulku aspoň pět otázek a ke každé napiš dotaz:</w:t>
       </w:r>
     </w:p>
     <w:p>
@@ -2286,7 +2286,7 @@
         <w:spacing w:after="60"/>
       </w:pPr>
       <w:r>
-        <w:t xml:space="preserve">jednu s podmínkou WHERE,</w:t>
+        <w:t xml:space="preserve">jednu s podmínkou WHERE,</w:t>
       </w:r>
     </w:p>
     <w:p>
@@ -2346,7 +2346,7 @@
         <w:spacing w:after="100"/>
       </w:pPr>
       <w:r>
-        <w:t xml:space="preserve">U každé si zapiš i odpověď jednou větou – třeba „Nejvýš hodnotím sci-fi, průměr 9,3.“</w:t>
+        <w:t xml:space="preserve">U každé si zapiš i odpověď jednou větou – třeba „Nejvýš hodnotím sci-fi, průměr 9,3.“</w:t>
       </w:r>
     </w:p>
     <w:p>
@@ -2369,7 +2369,7 @@
         <w:t xml:space="preserve">1.	</w:t>
       </w:r>
       <w:r>
-        <w:t xml:space="preserve">Spusť dotaz, jehož výsledek chceš mít v Excelu (třeba ten s GROUP BY).</w:t>
+        <w:t xml:space="preserve">Spusť dotaz, jehož výsledek chceš mít v Excelu (třeba ten s GROUP BY).</w:t>
       </w:r>
     </w:p>
     <w:p>
@@ -2414,7 +2414,7 @@
         <w:t xml:space="preserve">4.	</w:t>
       </w:r>
       <w:r>
-        <w:t xml:space="preserve">Otevři ho v Excelu a udělej z něj graf.</w:t>
+        <w:t xml:space="preserve">Otevři ho v Excelu a udělej z něj graf.</w:t>
       </w:r>
     </w:p>
     <w:p>
@@ -2443,7 +2443,7 @@
         <w:spacing w:after="100"/>
       </w:pPr>
       <w:r>
-        <w:t xml:space="preserve">Databáze je uložená jen v prohlížeči na tomhle počítači. Na jiném počítači (nebo po smazání profilu) tam nebude.</w:t>
+        <w:t xml:space="preserve">Databáze je uložená jen v prohlížeči na tomhle počítači. Na jiném počítači (nebo po smazání profilu) tam nebude.</w:t>
       </w:r>
     </w:p>
     <w:p>
@@ -2481,7 +2481,7 @@
         <w:spacing w:after="60"/>
       </w:pPr>
       <w:r>
-        <w:t xml:space="preserve">Příště ji otevřeš přes Soubor → Nahrát databázi z počítače… Soubor .db otevře i skutečný program DB Browser for SQLite.</w:t>
+        <w:t xml:space="preserve">Příště ji otevřeš přes Soubor → Nahrát databázi z počítače… Soubor .db otevře i skutečný program DB Browser for SQLite.</w:t>
       </w:r>
     </w:p>
     <w:p>
@@ -2561,7 +2561,7 @@
                 <w:sz w:val="20"/>
                 <w:szCs w:val="20"/>
               </w:rPr>
-              <w:t xml:space="preserve">Co s tím</w:t>
+              <w:t xml:space="preserve">Co s tím</w:t>
             </w:r>
           </w:p>
         </w:tc>
@@ -2617,7 +2617,7 @@
                 <w:sz w:val="21"/>
                 <w:szCs w:val="21"/>
               </w:rPr>
-              <w:t xml:space="preserve">Vybral(a) jsi sešit .xlsx. Ulož ho z Excelu jako CSV (krok 2).</w:t>
+              <w:t xml:space="preserve">Vybral(a) jsi sešit .xlsx. Ulož ho z Excelu jako CSV (krok 2).</w:t>
             </w:r>
           </w:p>
         </w:tc>
@@ -2673,7 +2673,7 @@
                 <w:sz w:val="21"/>
                 <w:szCs w:val="21"/>
               </w:rPr>
-              <w:t xml:space="preserve">Tabulka z CSV se přidává do otevřené databáze. Soubor → Nová databáze…</w:t>
+              <w:t xml:space="preserve">Tabulka z CSV se přidává do otevřené databáze. Soubor → Nová databáze…</w:t>
             </w:r>
           </w:p>
         </w:tc>
@@ -2704,7 +2704,7 @@
                 <w:sz w:val="21"/>
                 <w:szCs w:val="21"/>
               </w:rPr>
-              <w:t xml:space="preserve">„Tabulka … už v databázi je“</w:t>
+              <w:t xml:space="preserve">„Tabulka … už v databázi je“</w:t>
             </w:r>
           </w:p>
         </w:tc>
@@ -2729,7 +2729,7 @@
                 <w:sz w:val="21"/>
                 <w:szCs w:val="21"/>
               </w:rPr>
-              <w:t xml:space="preserve">Při importu přepiš název tabulky, nebo starou smaž: karta Struktura databáze, vyber ji a klikni na Smazat tabulku.</w:t>
+              <w:t xml:space="preserve">Při importu přepiš název tabulky, nebo starou smaž: karta Struktura databáze, vyber ji a klikni na Smazat tabulku.</w:t>
             </w:r>
           </w:p>
         </w:tc>
@@ -2760,7 +2760,7 @@
                 <w:sz w:val="21"/>
                 <w:szCs w:val="21"/>
               </w:rPr>
-              <w:t xml:space="preserve">U čísel je v náhledu TEXT.</w:t>
+              <w:t xml:space="preserve">U čísel je v náhledu TEXT.</w:t>
             </w:r>
           </w:p>
         </w:tc>
@@ -2785,7 +2785,7 @@
                 <w:sz w:val="21"/>
                 <w:szCs w:val="21"/>
               </w:rPr>
-              <w:t xml:space="preserve">Ve sloupci je jednotka, mezera mezi tisíci nebo slovo. Oprav to v Excelu, ulož CSV znovu a importuj znovu.</w:t>
+              <w:t xml:space="preserve">Ve sloupci je jednotka, mezera mezi tisíci nebo slovo. Oprav to v Excelu, ulož CSV znovu a importuj znovu.</w:t>
             </w:r>
           </w:p>
         </w:tc>
@@ -2841,7 +2841,7 @@
                 <w:sz w:val="21"/>
                 <w:szCs w:val="21"/>
               </w:rPr>
-              <w:t xml:space="preserve">Sloupec se jmenuje jinak, než píšeš – bez háčků a mezer. Přesné názvy jsou na kartě Struktura databáze. Nebo chybí apostrofy kolem textu.</w:t>
+              <w:t xml:space="preserve">Sloupec se jmenuje jinak, než píšeš – bez háčků a mezer. Přesné názvy jsou na kartě Struktura databáze. Nebo chybí apostrofy kolem textu.</w:t>
             </w:r>
           </w:p>
         </w:tc>
@@ -2897,7 +2897,7 @@
                 <w:sz w:val="21"/>
                 <w:szCs w:val="21"/>
               </w:rPr>
-              <w:t xml:space="preserve">Sloupec je uložený jako TEXT. Viz o dva řádky výš.</w:t>
+              <w:t xml:space="preserve">Sloupec je uložený jako TEXT. Viz o dva řádky výš.</w:t>
             </w:r>
           </w:p>
         </w:tc>
@@ -2953,7 +2953,7 @@
                 <w:sz w:val="21"/>
                 <w:szCs w:val="21"/>
               </w:rPr>
-              <w:t xml:space="preserve">Do prohlížeče se vejde nejvýš 5 000 řádků z jednoho CSV a soubor do 2 MB. Zmenši tabulku.</w:t>
+              <w:t xml:space="preserve">Do prohlížeče se vejde nejvýš 5 000 řádků z jednoho CSV a soubor do 2 MB. Zmenši tabulku.</w:t>
             </w:r>
           </w:p>
         </w:tc>

</xml_diff>